<commit_message>
Revert today's two commits pending manual approval
Reverts bfc6b1a (white paper, presentation notes, journal-club notes) and
bcb09d7 (repo tidy) at the author's request. The repository tree is now identical
to 93b926c, the last commit from 2026-08-05.

Done as a revert commit rather than a history rewrite, so nothing is force-pushed
and the reverted content stays recoverable.

The files themselves are retained locally and will be re-added only on explicit
approval, one at a time.

Co-Authored-By: Claude Opus 5 <noreply@anthropic.com>
</commit_message>
<xml_diff>
--- a/PLAIN_SUMMARY.docx
+++ b/PLAIN_SUMMARY.docx
@@ -4,14 +4,12 @@
   <w:body>
     <w:p>
       <w:pPr>
-        <w:pStyle w:val="Heading1"/>
         <w:spacing w:before="40" w:after="60"/>
       </w:pPr>
       <w:r>
         <w:rPr>
           <w:rFonts w:ascii="Calibri" w:hAnsi="Calibri"/>
           <w:b/>
-          <w:color w:val="000000"/>
           <w:sz w:val="30"/>
         </w:rPr>
         <w:t>What we found — in plain English</w:t>
@@ -70,7 +68,6 @@
     </w:p>
     <w:p>
       <w:pPr>
-        <w:pStyle w:val="Heading2"/>
         <w:spacing w:before="220" w:after="100"/>
       </w:pPr>
       <w:r>
@@ -197,7 +194,6 @@
     </w:p>
     <w:p>
       <w:pPr>
-        <w:pStyle w:val="Heading2"/>
         <w:spacing w:before="220" w:after="100"/>
       </w:pPr>
       <w:r>
@@ -254,7 +250,6 @@
     </w:p>
     <w:p>
       <w:pPr>
-        <w:pStyle w:val="Heading2"/>
         <w:spacing w:before="220" w:after="100"/>
       </w:pPr>
       <w:r>
@@ -947,7 +942,6 @@
     </w:p>
     <w:p>
       <w:pPr>
-        <w:pStyle w:val="Heading2"/>
         <w:spacing w:before="220" w:after="100"/>
       </w:pPr>
       <w:r>
@@ -1034,7 +1028,6 @@
     </w:p>
     <w:p>
       <w:pPr>
-        <w:pStyle w:val="Heading2"/>
         <w:spacing w:before="220" w:after="100"/>
       </w:pPr>
       <w:r>

</xml_diff>